<commit_message>
QA EID submission readiness and rebuild path
</commit_message>
<xml_diff>
--- a/docs/submission_eid/author_statements.docx
+++ b/docs/submission_eid/author_statements.docx
@@ -434,6 +434,51 @@
           <w:i w:val="0"/>
           <w:sz w:val="24"/>
         </w:rPr>
+        <w:t>EID Author Checklist Reminder</w:t>
+      </w:r>
+    </w:p>
+    <w:p>
+      <w:pPr>
+        <w:spacing w:before="0" w:after="0" w:line="480" w:lineRule="auto"/>
+        <w:jc w:val="left"/>
+      </w:pPr>
+      <w:r>
+        <w:rPr>
+          <w:rFonts w:ascii="Times New Roman" w:hAnsi="Times New Roman"/>
+          <w:b w:val="0"/>
+          <w:i w:val="0"/>
+          <w:sz w:val="24"/>
+        </w:rPr>
+        <w:t>The EID Author Checklist should be completed during portal submission, including</w:t>
+      </w:r>
+    </w:p>
+    <w:p>
+      <w:pPr>
+        <w:spacing w:before="0" w:after="0" w:line="480" w:lineRule="auto"/>
+        <w:jc w:val="left"/>
+      </w:pPr>
+      <w:r>
+        <w:rPr>
+          <w:rFonts w:ascii="Times New Roman" w:hAnsi="Times New Roman"/>
+          <w:b w:val="0"/>
+          <w:i w:val="0"/>
+          <w:sz w:val="24"/>
+        </w:rPr>
+        <w:t>the chatbot/AI-use disclosure and image-manipulation attestations.</w:t>
+      </w:r>
+    </w:p>
+    <w:p>
+      <w:pPr>
+        <w:spacing w:before="120" w:after="0" w:line="480" w:lineRule="auto"/>
+        <w:jc w:val="left"/>
+      </w:pPr>
+      <w:r>
+        <w:rPr>
+          <w:rFonts w:ascii="Times New Roman" w:hAnsi="Times New Roman"/>
+          <w:b/>
+          <w:i w:val="0"/>
+          <w:sz w:val="24"/>
+        </w:rPr>
         <w:t>CRediT Author Contributions</w:t>
       </w:r>
     </w:p>

</xml_diff>

<commit_message>
Finalize EID paper DOCX readiness
</commit_message>
<xml_diff>
--- a/docs/submission_eid/author_statements.docx
+++ b/docs/submission_eid/author_statements.docx
@@ -44,52 +44,7 @@
           <w:i w:val="0"/>
           <w:sz w:val="24"/>
         </w:rPr>
-        <w:t>This study used aggregate, publicly available surveillance data at the</w:t>
-      </w:r>
-    </w:p>
-    <w:p>
-      <w:pPr>
-        <w:spacing w:before="0" w:after="0" w:line="480" w:lineRule="auto"/>
-        <w:jc w:val="left"/>
-      </w:pPr>
-      <w:r>
-        <w:rPr>
-          <w:rFonts w:ascii="Times New Roman" w:hAnsi="Times New Roman"/>
-          <w:b w:val="0"/>
-          <w:i w:val="0"/>
-          <w:sz w:val="24"/>
-        </w:rPr>
-        <w:t>country-year level. No individual-level, clinical, address-level, or restricted</w:t>
-      </w:r>
-    </w:p>
-    <w:p>
-      <w:pPr>
-        <w:spacing w:before="0" w:after="0" w:line="480" w:lineRule="auto"/>
-        <w:jc w:val="left"/>
-      </w:pPr>
-      <w:r>
-        <w:rPr>
-          <w:rFonts w:ascii="Times New Roman" w:hAnsi="Times New Roman"/>
-          <w:b w:val="0"/>
-          <w:i w:val="0"/>
-          <w:sz w:val="24"/>
-        </w:rPr>
-        <w:t>human-subject data were accessed. Institutional review was not required for</w:t>
-      </w:r>
-    </w:p>
-    <w:p>
-      <w:pPr>
-        <w:spacing w:before="0" w:after="0" w:line="480" w:lineRule="auto"/>
-        <w:jc w:val="left"/>
-      </w:pPr>
-      <w:r>
-        <w:rPr>
-          <w:rFonts w:ascii="Times New Roman" w:hAnsi="Times New Roman"/>
-          <w:b w:val="0"/>
-          <w:i w:val="0"/>
-          <w:sz w:val="24"/>
-        </w:rPr>
-        <w:t>secondary analysis of publicly available aggregate data.</w:t>
+        <w:t>This study used aggregate, publicly available surveillance data at the country-year level. No individual-level, clinical, address-level, or restricted human-subject data were accessed. Institutional review was not required for secondary analysis of publicly available aggregate data.</w:t>
       </w:r>
     </w:p>
     <w:p>
@@ -179,67 +134,7 @@
           <w:i w:val="0"/>
           <w:sz w:val="24"/>
         </w:rPr>
-        <w:t>Artificial intelligence tools were used to assist with manuscript planning,</w:t>
-      </w:r>
-    </w:p>
-    <w:p>
-      <w:pPr>
-        <w:spacing w:before="0" w:after="0" w:line="480" w:lineRule="auto"/>
-        <w:jc w:val="left"/>
-      </w:pPr>
-      <w:r>
-        <w:rPr>
-          <w:rFonts w:ascii="Times New Roman" w:hAnsi="Times New Roman"/>
-          <w:b w:val="0"/>
-          <w:i w:val="0"/>
-          <w:sz w:val="24"/>
-        </w:rPr>
-        <w:t>language editing, and pre-submission quality checks. No confidential or</w:t>
-      </w:r>
-    </w:p>
-    <w:p>
-      <w:pPr>
-        <w:spacing w:before="0" w:after="0" w:line="480" w:lineRule="auto"/>
-        <w:jc w:val="left"/>
-      </w:pPr>
-      <w:r>
-        <w:rPr>
-          <w:rFonts w:ascii="Times New Roman" w:hAnsi="Times New Roman"/>
-          <w:b w:val="0"/>
-          <w:i w:val="0"/>
-          <w:sz w:val="24"/>
-        </w:rPr>
-        <w:t>nonpublic data were entered into AI tools. The author verified all analyses,</w:t>
-      </w:r>
-    </w:p>
-    <w:p>
-      <w:pPr>
-        <w:spacing w:before="0" w:after="0" w:line="480" w:lineRule="auto"/>
-        <w:jc w:val="left"/>
-      </w:pPr>
-      <w:r>
-        <w:rPr>
-          <w:rFonts w:ascii="Times New Roman" w:hAnsi="Times New Roman"/>
-          <w:b w:val="0"/>
-          <w:i w:val="0"/>
-          <w:sz w:val="24"/>
-        </w:rPr>
-        <w:t>references, and claims and accepts responsibility for the final manuscript. No</w:t>
-      </w:r>
-    </w:p>
-    <w:p>
-      <w:pPr>
-        <w:spacing w:before="0" w:after="0" w:line="480" w:lineRule="auto"/>
-        <w:jc w:val="left"/>
-      </w:pPr>
-      <w:r>
-        <w:rPr>
-          <w:rFonts w:ascii="Times New Roman" w:hAnsi="Times New Roman"/>
-          <w:b w:val="0"/>
-          <w:i w:val="0"/>
-          <w:sz w:val="24"/>
-        </w:rPr>
-        <w:t>AI-generated figures were used.</w:t>
+        <w:t>Artificial intelligence tools were used to assist with manuscript planning, language editing, and pre-submission quality checks. No confidential or nonpublic data were entered into AI tools. The author verified all analyses, references, and claims and accepts responsibility for the final manuscript. No AI-generated figures were used.</w:t>
       </w:r>
     </w:p>
     <w:p>
@@ -269,52 +164,7 @@
           <w:i w:val="0"/>
           <w:sz w:val="24"/>
         </w:rPr>
-        <w:t>All analysis code, processed public-data tables, data dictionaries, and</w:t>
-      </w:r>
-    </w:p>
-    <w:p>
-      <w:pPr>
-        <w:spacing w:before="0" w:after="0" w:line="480" w:lineRule="auto"/>
-        <w:jc w:val="left"/>
-      </w:pPr>
-      <w:r>
-        <w:rPr>
-          <w:rFonts w:ascii="Times New Roman" w:hAnsi="Times New Roman"/>
-          <w:b w:val="0"/>
-          <w:i w:val="0"/>
-          <w:sz w:val="24"/>
-        </w:rPr>
-        <w:t>reproducibility scripts are archived at https://doi.org/10.5281/zenodo.20150542.</w:t>
-      </w:r>
-    </w:p>
-    <w:p>
-      <w:pPr>
-        <w:spacing w:before="0" w:after="0" w:line="480" w:lineRule="auto"/>
-        <w:jc w:val="left"/>
-      </w:pPr>
-      <w:r>
-        <w:rPr>
-          <w:rFonts w:ascii="Times New Roman" w:hAnsi="Times New Roman"/>
-          <w:b w:val="0"/>
-          <w:i w:val="0"/>
-          <w:sz w:val="24"/>
-        </w:rPr>
-        <w:t>Before final submission, this DOI must be verified against the final clean</w:t>
-      </w:r>
-    </w:p>
-    <w:p>
-      <w:pPr>
-        <w:spacing w:before="0" w:after="0" w:line="480" w:lineRule="auto"/>
-        <w:jc w:val="left"/>
-      </w:pPr>
-      <w:r>
-        <w:rPr>
-          <w:rFonts w:ascii="Times New Roman" w:hAnsi="Times New Roman"/>
-          <w:b w:val="0"/>
-          <w:i w:val="0"/>
-          <w:sz w:val="24"/>
-        </w:rPr>
-        <w:t>archive version.</w:t>
+        <w:t>All analysis code, processed public-data tables, data dictionaries, and reproducibility scripts are archived at https://doi.org/10.5281/zenodo.20150542. Before final submission, this DOI must be verified against the final clean archive version.</w:t>
       </w:r>
     </w:p>
     <w:p>
@@ -334,6 +184,7 @@
     </w:p>
     <w:p>
       <w:pPr>
+        <w:pStyle w:val="ListBullet"/>
         <w:spacing w:before="0" w:after="0" w:line="480" w:lineRule="auto"/>
         <w:jc w:val="left"/>
       </w:pPr>
@@ -344,11 +195,12 @@
           <w:i w:val="0"/>
           <w:sz w:val="24"/>
         </w:rPr>
-        <w:t>- ECDC Annual Epidemiological Reports (https://www.ecdc.europa.eu)</w:t>
+        <w:t>ECDC Annual Epidemiological Reports (https://www.ecdc.europa.eu)</w:t>
       </w:r>
     </w:p>
     <w:p>
       <w:pPr>
+        <w:pStyle w:val="ListBullet"/>
         <w:spacing w:before="0" w:after="0" w:line="480" w:lineRule="auto"/>
         <w:jc w:val="left"/>
       </w:pPr>
@@ -359,11 +211,12 @@
           <w:i w:val="0"/>
           <w:sz w:val="24"/>
         </w:rPr>
-        <w:t>- World Bank Open Data (https://data.worldbank.org)</w:t>
+        <w:t>World Bank Open Data (https://data.worldbank.org)</w:t>
       </w:r>
     </w:p>
     <w:p>
       <w:pPr>
+        <w:pStyle w:val="ListBullet"/>
         <w:spacing w:before="0" w:after="0" w:line="480" w:lineRule="auto"/>
         <w:jc w:val="left"/>
       </w:pPr>
@@ -374,11 +227,12 @@
           <w:i w:val="0"/>
           <w:sz w:val="24"/>
         </w:rPr>
-        <w:t>- FAOSTAT (https://www.fao.org/faostat)</w:t>
+        <w:t>FAOSTAT (https://www.fao.org/faostat)</w:t>
       </w:r>
     </w:p>
     <w:p>
       <w:pPr>
+        <w:pStyle w:val="ListBullet"/>
         <w:spacing w:before="0" w:after="0" w:line="480" w:lineRule="auto"/>
         <w:jc w:val="left"/>
       </w:pPr>
@@ -389,11 +243,12 @@
           <w:i w:val="0"/>
           <w:sz w:val="24"/>
         </w:rPr>
-        <w:t>- TerraClimate (https://www.climatologylab.org/terraclimate.html)</w:t>
+        <w:t>TerraClimate (https://www.climatologylab.org/terraclimate.html)</w:t>
       </w:r>
     </w:p>
     <w:p>
       <w:pPr>
+        <w:pStyle w:val="ListBullet"/>
         <w:spacing w:before="0" w:after="0" w:line="480" w:lineRule="auto"/>
         <w:jc w:val="left"/>
       </w:pPr>
@@ -404,7 +259,7 @@
           <w:i w:val="0"/>
           <w:sz w:val="24"/>
         </w:rPr>
-        <w:t>- Natural Earth (https://www.naturalearthdata.com)</w:t>
+        <w:t>Natural Earth (https://www.naturalearthdata.com)</w:t>
       </w:r>
     </w:p>
     <w:p>
@@ -449,22 +304,7 @@
           <w:i w:val="0"/>
           <w:sz w:val="24"/>
         </w:rPr>
-        <w:t>The EID Author Checklist should be completed during portal submission, including</w:t>
-      </w:r>
-    </w:p>
-    <w:p>
-      <w:pPr>
-        <w:spacing w:before="0" w:after="0" w:line="480" w:lineRule="auto"/>
-        <w:jc w:val="left"/>
-      </w:pPr>
-      <w:r>
-        <w:rPr>
-          <w:rFonts w:ascii="Times New Roman" w:hAnsi="Times New Roman"/>
-          <w:b w:val="0"/>
-          <w:i w:val="0"/>
-          <w:sz w:val="24"/>
-        </w:rPr>
-        <w:t>the chatbot/AI-use disclosure and image-manipulation attestations.</w:t>
+        <w:t>The EID Author Checklist should be completed during portal submission, including the chatbot/AI-use disclosure and image-manipulation attestations.</w:t>
       </w:r>
     </w:p>
     <w:p>
@@ -494,37 +334,7 @@
           <w:i w:val="0"/>
           <w:sz w:val="24"/>
         </w:rPr>
-        <w:t>Julian Juan: Conceptualization, Data curation, Formal analysis, Investigation,</w:t>
-      </w:r>
-    </w:p>
-    <w:p>
-      <w:pPr>
-        <w:spacing w:before="0" w:after="0" w:line="480" w:lineRule="auto"/>
-        <w:jc w:val="left"/>
-      </w:pPr>
-      <w:r>
-        <w:rPr>
-          <w:rFonts w:ascii="Times New Roman" w:hAnsi="Times New Roman"/>
-          <w:b w:val="0"/>
-          <w:i w:val="0"/>
-          <w:sz w:val="24"/>
-        </w:rPr>
-        <w:t>Methodology, Software, Validation, Visualization, Writing - original draft,</w:t>
-      </w:r>
-    </w:p>
-    <w:p>
-      <w:pPr>
-        <w:spacing w:before="0" w:after="0" w:line="480" w:lineRule="auto"/>
-        <w:jc w:val="left"/>
-      </w:pPr>
-      <w:r>
-        <w:rPr>
-          <w:rFonts w:ascii="Times New Roman" w:hAnsi="Times New Roman"/>
-          <w:b w:val="0"/>
-          <w:i w:val="0"/>
-          <w:sz w:val="24"/>
-        </w:rPr>
-        <w:t>Writing - review and editing.</w:t>
+        <w:t>Julian Juan: Conceptualization, Data curation, Formal analysis, Investigation, Methodology, Software, Validation, Visualization, Writing - original draft, Writing - review and editing.</w:t>
       </w:r>
     </w:p>
     <w:p>
@@ -554,22 +364,7 @@
           <w:i w:val="0"/>
           <w:sz w:val="24"/>
         </w:rPr>
-        <w:t>Julian Juan is an independent researcher interested in reproducible infectious</w:t>
-      </w:r>
-    </w:p>
-    <w:p>
-      <w:pPr>
-        <w:spacing w:before="0" w:after="0" w:line="480" w:lineRule="auto"/>
-        <w:jc w:val="left"/>
-      </w:pPr>
-      <w:r>
-        <w:rPr>
-          <w:rFonts w:ascii="Times New Roman" w:hAnsi="Times New Roman"/>
-          <w:b w:val="0"/>
-          <w:i w:val="0"/>
-          <w:sz w:val="24"/>
-        </w:rPr>
-        <w:t>disease surveillance, probabilistic evaluation, and public-health modeling.</w:t>
+        <w:t>Julian Juan is an independent researcher interested in reproducible infectious disease surveillance, probabilistic evaluation, and public-health modeling.</w:t>
       </w:r>
     </w:p>
     <w:p>
@@ -629,22 +424,7 @@
           <w:i w:val="0"/>
           <w:sz w:val="24"/>
         </w:rPr>
-        <w:t>hantavirus; zoonoses; disease surveillance; European Union; European Economic</w:t>
-      </w:r>
-    </w:p>
-    <w:p>
-      <w:pPr>
-        <w:spacing w:before="0" w:after="0" w:line="480" w:lineRule="auto"/>
-        <w:jc w:val="left"/>
-      </w:pPr>
-      <w:r>
-        <w:rPr>
-          <w:rFonts w:ascii="Times New Roman" w:hAnsi="Times New Roman"/>
-          <w:b w:val="0"/>
-          <w:i w:val="0"/>
-          <w:sz w:val="24"/>
-        </w:rPr>
-        <w:t>Area; probabilistic forecasting; calibration; public health surveillance</w:t>
+        <w:t>hantavirus; zoonoses; disease surveillance; European Union; European Economic Area; probabilistic forecasting; calibration; public health surveillance</w:t>
       </w:r>
     </w:p>
     <w:sectPr>

</xml_diff>